<commit_message>
calctapp answering-brief: cover lines and docx single lines set more than solid (DEF-FORM-004); text-overlap keeps a 13 pt run's size under LibreOffice's 1.66-em Schola boxes (fb-595.70)
typst: the cover set leading 0 between ascender and baseline edges, 9.6 pt apart in 13 pt type; it now takes the
template's single leading (13.8 pt). docx: Word's single (240 auto) sets TeX Gyre Schola 12.2 pt apart in
LibreOffice; single lines are exact 276-twip boxes (the typst single pitch), the cover's rules thin line boxes and
its gaps 6.5 pt, so the cover stays one page. fb text-overlap held a word's size to at least its box over 1.45,
which read LibreOffice's Schola (box 1.66 of the size) as 14.86 pt; the bound is now BOX_MAX 1.7, with a test that
13.8 pt apart passes and 12.2 pt apart still fails.

Co-Authored-By: Claude Opus 5.5 <noreply@anthropic.com>
Gate: fb-595-70-a2 31e80221eecfb13cefc46c39aef01b757ceb56e4
</commit_message>
<xml_diff>
--- a/courts/ninth-circuit/california/state/courts-of-appeal/answering-brief/usage/OUTPUT-answering-brief.docx
+++ b/courts/ninth-circuit/california/state/courts-of-appeal/answering-brief/usage/OUTPUT-answering-brief.docx
@@ -4,7 +4,7 @@
   <w:body>
     <w:p>
       <w:pPr>
-        <w:spacing w:before="0" w:after="160" w:line="240" w:lineRule="auto"/>
+        <w:spacing w:before="0" w:after="130" w:line="276" w:lineRule="exact"/>
         <w:ind w:left="0" w:right="0" w:firstLine="0"/>
         <w:jc w:val="center"/>
       </w:pPr>
@@ -28,13 +28,13 @@
         <w:pBdr>
           <w:bottom w:val="double" w:sz="6" w:space="1" w:color="000000"/>
         </w:pBdr>
-        <w:spacing w:before="0" w:after="160" w:line="240" w:lineRule="auto"/>
+        <w:spacing w:before="0" w:after="130" w:line="120" w:lineRule="exact"/>
         <w:ind w:left="0" w:right="0" w:firstLine="0"/>
       </w:pPr>
     </w:p>
     <w:p>
       <w:pPr>
-        <w:spacing w:before="0" w:after="80" w:line="240" w:lineRule="auto"/>
+        <w:spacing w:before="0" w:after="80" w:line="276" w:lineRule="exact"/>
         <w:ind w:left="0" w:right="0" w:firstLine="0"/>
         <w:jc w:val="center"/>
       </w:pPr>
@@ -48,7 +48,7 @@
     </w:p>
     <w:p>
       <w:pPr>
-        <w:spacing w:before="0" w:after="160" w:line="240" w:lineRule="auto"/>
+        <w:spacing w:before="0" w:after="130" w:line="276" w:lineRule="exact"/>
         <w:ind w:left="0" w:right="0" w:firstLine="0"/>
         <w:jc w:val="center"/>
       </w:pPr>
@@ -98,13 +98,13 @@
         <w:pBdr>
           <w:bottom w:val="single" w:sz="6" w:space="1" w:color="000000"/>
         </w:pBdr>
-        <w:spacing w:before="0" w:after="160" w:line="240" w:lineRule="auto"/>
+        <w:spacing w:before="0" w:after="130" w:line="120" w:lineRule="exact"/>
         <w:ind w:left="2520" w:right="2520" w:firstLine="0"/>
       </w:pPr>
     </w:p>
     <w:p>
       <w:pPr>
-        <w:spacing w:before="0" w:after="0" w:line="240" w:lineRule="auto"/>
+        <w:spacing w:before="0" w:after="0" w:line="276" w:lineRule="exact"/>
         <w:ind w:left="0" w:right="0" w:firstLine="0"/>
         <w:jc w:val="center"/>
       </w:pPr>
@@ -120,7 +120,7 @@
     </w:p>
     <w:p>
       <w:pPr>
-        <w:spacing w:before="0" w:after="0" w:line="240" w:lineRule="auto"/>
+        <w:spacing w:before="0" w:after="0" w:line="276" w:lineRule="exact"/>
         <w:ind w:left="0" w:right="0" w:firstLine="0"/>
         <w:jc w:val="center"/>
       </w:pPr>
@@ -134,7 +134,7 @@
     </w:p>
     <w:p>
       <w:pPr>
-        <w:spacing w:before="60" w:after="60" w:line="240" w:lineRule="auto"/>
+        <w:spacing w:before="60" w:after="60" w:line="276" w:lineRule="exact"/>
         <w:ind w:left="0" w:right="0" w:firstLine="0"/>
         <w:jc w:val="center"/>
       </w:pPr>
@@ -144,7 +144,7 @@
     </w:p>
     <w:p>
       <w:pPr>
-        <w:spacing w:before="0" w:after="0" w:line="240" w:lineRule="auto"/>
+        <w:spacing w:before="0" w:after="0" w:line="276" w:lineRule="exact"/>
         <w:ind w:left="0" w:right="0" w:firstLine="0"/>
         <w:jc w:val="center"/>
       </w:pPr>
@@ -184,7 +184,7 @@
     </w:p>
     <w:p>
       <w:pPr>
-        <w:spacing w:before="0" w:after="0" w:line="240" w:lineRule="auto"/>
+        <w:spacing w:before="0" w:after="0" w:line="276" w:lineRule="exact"/>
         <w:ind w:left="0" w:right="0" w:firstLine="0"/>
         <w:jc w:val="center"/>
       </w:pPr>
@@ -201,13 +201,13 @@
         <w:pBdr>
           <w:bottom w:val="single" w:sz="6" w:space="1" w:color="000000"/>
         </w:pBdr>
-        <w:spacing w:before="0" w:after="160" w:line="240" w:lineRule="auto"/>
+        <w:spacing w:before="0" w:after="130" w:line="120" w:lineRule="exact"/>
         <w:ind w:left="2520" w:right="2520" w:firstLine="0"/>
       </w:pPr>
     </w:p>
     <w:p>
       <w:pPr>
-        <w:spacing w:before="0" w:after="0" w:line="240" w:lineRule="auto"/>
+        <w:spacing w:before="0" w:after="0" w:line="276" w:lineRule="exact"/>
         <w:ind w:left="0" w:right="0" w:firstLine="0"/>
         <w:jc w:val="center"/>
       </w:pPr>
@@ -247,7 +247,7 @@
     </w:p>
     <w:p>
       <w:pPr>
-        <w:spacing w:before="0" w:after="160" w:line="240" w:lineRule="auto"/>
+        <w:spacing w:before="0" w:after="130" w:line="276" w:lineRule="exact"/>
         <w:ind w:left="0" w:right="0" w:firstLine="0"/>
         <w:jc w:val="center"/>
       </w:pPr>
@@ -278,13 +278,13 @@
         <w:pBdr>
           <w:bottom w:val="single" w:sz="6" w:space="1" w:color="000000"/>
         </w:pBdr>
-        <w:spacing w:before="0" w:after="160" w:line="240" w:lineRule="auto"/>
+        <w:spacing w:before="0" w:after="130" w:line="120" w:lineRule="exact"/>
         <w:ind w:left="2520" w:right="2520" w:firstLine="0"/>
       </w:pPr>
     </w:p>
     <w:p>
       <w:pPr>
-        <w:spacing w:before="0" w:after="160" w:line="240" w:lineRule="auto"/>
+        <w:spacing w:before="0" w:after="130" w:line="276" w:lineRule="exact"/>
         <w:ind w:left="0" w:right="0" w:firstLine="0"/>
         <w:jc w:val="center"/>
       </w:pPr>
@@ -318,13 +318,13 @@
         <w:pBdr>
           <w:bottom w:val="single" w:sz="6" w:space="1" w:color="000000"/>
         </w:pBdr>
-        <w:spacing w:before="0" w:after="160" w:line="240" w:lineRule="auto"/>
+        <w:spacing w:before="0" w:after="130" w:line="120" w:lineRule="exact"/>
         <w:ind w:left="2520" w:right="2520" w:firstLine="0"/>
       </w:pPr>
     </w:p>
     <w:p>
       <w:pPr>
-        <w:spacing w:before="0" w:after="0" w:line="240" w:lineRule="auto"/>
+        <w:spacing w:before="0" w:after="0" w:line="276" w:lineRule="exact"/>
         <w:ind w:left="0" w:right="0" w:firstLine="0"/>
         <w:jc w:val="center"/>
       </w:pPr>
@@ -334,7 +334,7 @@
     </w:p>
     <w:p>
       <w:pPr>
-        <w:spacing w:before="0" w:after="0" w:line="240" w:lineRule="auto"/>
+        <w:spacing w:before="0" w:after="0" w:line="276" w:lineRule="exact"/>
         <w:ind w:left="0" w:right="0" w:firstLine="0"/>
         <w:jc w:val="center"/>
       </w:pPr>
@@ -344,7 +344,7 @@
     </w:p>
     <w:p>
       <w:pPr>
-        <w:spacing w:before="0" w:after="0" w:line="240" w:lineRule="auto"/>
+        <w:spacing w:before="0" w:after="0" w:line="276" w:lineRule="exact"/>
         <w:ind w:left="0" w:right="0" w:firstLine="0"/>
         <w:jc w:val="center"/>
       </w:pPr>
@@ -354,7 +354,7 @@
     </w:p>
     <w:p>
       <w:pPr>
-        <w:spacing w:before="0" w:after="0" w:line="240" w:lineRule="auto"/>
+        <w:spacing w:before="0" w:after="0" w:line="276" w:lineRule="exact"/>
         <w:ind w:left="0" w:right="0" w:firstLine="0"/>
         <w:jc w:val="center"/>
       </w:pPr>
@@ -364,7 +364,7 @@
     </w:p>
     <w:p>
       <w:pPr>
-        <w:spacing w:before="0" w:after="0" w:line="240" w:lineRule="auto"/>
+        <w:spacing w:before="0" w:after="0" w:line="276" w:lineRule="exact"/>
         <w:ind w:left="0" w:right="0" w:firstLine="0"/>
         <w:jc w:val="center"/>
       </w:pPr>
@@ -374,7 +374,7 @@
     </w:p>
     <w:p>
       <w:pPr>
-        <w:spacing w:before="0" w:after="0" w:line="240" w:lineRule="auto"/>
+        <w:spacing w:before="0" w:after="0" w:line="276" w:lineRule="exact"/>
         <w:ind w:left="0" w:right="0" w:firstLine="0"/>
         <w:jc w:val="center"/>
       </w:pPr>
@@ -384,7 +384,7 @@
     </w:p>
     <w:p>
       <w:pPr>
-        <w:spacing w:before="0" w:after="0" w:line="240" w:lineRule="auto"/>
+        <w:spacing w:before="0" w:after="0" w:line="276" w:lineRule="exact"/>
         <w:ind w:left="0" w:right="0" w:firstLine="0"/>
         <w:jc w:val="center"/>
       </w:pPr>
@@ -394,7 +394,7 @@
     </w:p>
     <w:p>
       <w:pPr>
-        <w:spacing w:before="0" w:after="0" w:line="240" w:lineRule="auto"/>
+        <w:spacing w:before="0" w:after="0" w:line="276" w:lineRule="exact"/>
         <w:ind w:left="0" w:right="0" w:firstLine="0"/>
         <w:jc w:val="center"/>
       </w:pPr>
@@ -408,7 +408,7 @@
     </w:p>
     <w:p>
       <w:pPr>
-        <w:spacing w:before="0" w:after="0" w:line="240" w:lineRule="auto"/>
+        <w:spacing w:before="0" w:after="0" w:line="276" w:lineRule="exact"/>
         <w:ind w:left="0" w:right="0" w:firstLine="0"/>
         <w:jc w:val="center"/>
       </w:pPr>
@@ -422,7 +422,7 @@
     </w:p>
     <w:p>
       <w:pPr>
-        <w:spacing w:before="0" w:after="0" w:line="240" w:lineRule="auto"/>
+        <w:spacing w:before="0" w:after="0" w:line="276" w:lineRule="exact"/>
         <w:ind w:left="0" w:right="0" w:firstLine="0"/>
         <w:jc w:val="center"/>
       </w:pPr>
@@ -436,7 +436,7 @@
     </w:p>
     <w:p>
       <w:pPr>
-        <w:spacing w:before="0" w:after="0" w:line="240" w:lineRule="auto"/>
+        <w:spacing w:before="0" w:after="0" w:line="276" w:lineRule="exact"/>
         <w:ind w:left="0" w:right="0" w:firstLine="0"/>
         <w:jc w:val="center"/>
       </w:pPr>
@@ -479,7 +479,7 @@
           </w:tcPr>
           <w:p>
             <w:pPr>
-              <w:spacing w:before="0" w:after="0" w:line="240" w:lineRule="auto"/>
+              <w:spacing w:before="0" w:after="0" w:line="276" w:lineRule="exact"/>
               <w:ind w:left="0" w:right="0" w:firstLine="0"/>
               <w:jc w:val="left"/>
             </w:pPr>
@@ -489,7 +489,7 @@
           </w:p>
           <w:p>
             <w:pPr>
-              <w:spacing w:before="0" w:after="0" w:line="240" w:lineRule="auto"/>
+              <w:spacing w:before="0" w:after="0" w:line="276" w:lineRule="exact"/>
               <w:ind w:left="0" w:right="0" w:firstLine="0"/>
               <w:jc w:val="left"/>
             </w:pPr>
@@ -499,7 +499,7 @@
           </w:p>
           <w:p>
             <w:pPr>
-              <w:spacing w:before="0" w:after="0" w:line="240" w:lineRule="auto"/>
+              <w:spacing w:before="0" w:after="0" w:line="276" w:lineRule="exact"/>
               <w:ind w:left="0" w:right="0" w:firstLine="0"/>
               <w:jc w:val="left"/>
             </w:pPr>
@@ -513,7 +513,7 @@
           </w:p>
           <w:p>
             <w:pPr>
-              <w:spacing w:before="0" w:after="0" w:line="240" w:lineRule="auto"/>
+              <w:spacing w:before="0" w:after="0" w:line="276" w:lineRule="exact"/>
               <w:ind w:left="0" w:right="0" w:firstLine="0"/>
               <w:jc w:val="left"/>
             </w:pPr>
@@ -527,7 +527,7 @@
           </w:p>
           <w:p>
             <w:pPr>
-              <w:spacing w:before="0" w:after="0" w:line="240" w:lineRule="auto"/>
+              <w:spacing w:before="0" w:after="0" w:line="276" w:lineRule="exact"/>
               <w:ind w:left="0" w:right="0" w:firstLine="0"/>
               <w:jc w:val="left"/>
             </w:pPr>
@@ -541,7 +541,7 @@
           </w:p>
           <w:p>
             <w:pPr>
-              <w:spacing w:before="0" w:after="0" w:line="240" w:lineRule="auto"/>
+              <w:spacing w:before="0" w:after="0" w:line="276" w:lineRule="exact"/>
               <w:ind w:left="0" w:right="0" w:firstLine="0"/>
               <w:jc w:val="left"/>
             </w:pPr>
@@ -560,7 +560,7 @@
           </w:tcPr>
           <w:p>
             <w:pPr>
-              <w:spacing w:before="0" w:after="0" w:line="240" w:lineRule="auto"/>
+              <w:spacing w:before="0" w:after="0" w:line="276" w:lineRule="exact"/>
               <w:ind w:left="0" w:right="0" w:firstLine="0"/>
               <w:jc w:val="left"/>
             </w:pPr>
@@ -570,7 +570,7 @@
           </w:p>
           <w:p>
             <w:pPr>
-              <w:spacing w:before="0" w:after="0" w:line="240" w:lineRule="auto"/>
+              <w:spacing w:before="0" w:after="0" w:line="276" w:lineRule="exact"/>
               <w:ind w:left="0" w:right="0" w:firstLine="0"/>
               <w:jc w:val="left"/>
             </w:pPr>
@@ -580,7 +580,7 @@
           </w:p>
           <w:p>
             <w:pPr>
-              <w:spacing w:before="0" w:after="0" w:line="240" w:lineRule="auto"/>
+              <w:spacing w:before="0" w:after="0" w:line="276" w:lineRule="exact"/>
               <w:ind w:left="0" w:right="0" w:firstLine="0"/>
               <w:jc w:val="left"/>
             </w:pPr>
@@ -590,7 +590,7 @@
           </w:p>
           <w:p>
             <w:pPr>
-              <w:spacing w:before="0" w:after="0" w:line="240" w:lineRule="auto"/>
+              <w:spacing w:before="0" w:after="0" w:line="276" w:lineRule="exact"/>
               <w:ind w:left="0" w:right="0" w:firstLine="0"/>
               <w:jc w:val="left"/>
             </w:pPr>
@@ -604,7 +604,7 @@
           </w:p>
           <w:p>
             <w:pPr>
-              <w:spacing w:before="0" w:after="0" w:line="240" w:lineRule="auto"/>
+              <w:spacing w:before="0" w:after="0" w:line="276" w:lineRule="exact"/>
               <w:ind w:left="0" w:right="0" w:firstLine="0"/>
               <w:jc w:val="left"/>
             </w:pPr>
@@ -618,7 +618,7 @@
           </w:p>
           <w:p>
             <w:pPr>
-              <w:spacing w:before="0" w:after="0" w:line="240" w:lineRule="auto"/>
+              <w:spacing w:before="0" w:after="0" w:line="276" w:lineRule="exact"/>
               <w:ind w:left="0" w:right="0" w:firstLine="0"/>
               <w:jc w:val="left"/>
             </w:pPr>
@@ -632,7 +632,7 @@
           </w:p>
           <w:p>
             <w:pPr>
-              <w:spacing w:before="0" w:after="0" w:line="240" w:lineRule="auto"/>
+              <w:spacing w:before="0" w:after="0" w:line="276" w:lineRule="exact"/>
               <w:ind w:left="0" w:right="0" w:firstLine="0"/>
               <w:jc w:val="left"/>
             </w:pPr>
@@ -649,7 +649,7 @@
     </w:tbl>
     <w:p>
       <w:pPr>
-        <w:spacing w:before="160" w:after="160" w:line="240" w:lineRule="auto"/>
+        <w:spacing w:before="130" w:after="130" w:line="276" w:lineRule="exact"/>
         <w:ind w:left="0" w:right="0" w:firstLine="0"/>
         <w:jc w:val="center"/>
       </w:pPr>
@@ -722,7 +722,7 @@
         <w:pBdr>
           <w:bottom w:val="double" w:sz="6" w:space="1" w:color="000000"/>
         </w:pBdr>
-        <w:spacing w:before="0" w:after="0" w:line="240" w:lineRule="auto"/>
+        <w:spacing w:before="0" w:after="0" w:line="120" w:lineRule="exact"/>
         <w:ind w:left="0" w:right="0" w:firstLine="0"/>
       </w:pPr>
     </w:p>
@@ -731,7 +731,7 @@
         <w:pStyle w:val="Heading1"/>
         <w:keepNext/>
         <w:pageBreakBefore/>
-        <w:spacing w:before="0" w:after="240" w:line="240" w:lineRule="auto"/>
+        <w:spacing w:before="0" w:after="240" w:line="276" w:lineRule="exact"/>
         <w:ind w:left="0" w:right="0" w:firstLine="0"/>
         <w:jc w:val="center"/>
       </w:pPr>
@@ -746,7 +746,7 @@
     </w:p>
     <w:p>
       <w:pPr>
-        <w:spacing w:before="0" w:after="200" w:line="240" w:lineRule="auto"/>
+        <w:spacing w:before="0" w:after="200" w:line="276" w:lineRule="exact"/>
         <w:ind w:left="0" w:right="0" w:firstLine="0"/>
       </w:pPr>
       <w:r>
@@ -883,7 +883,7 @@
     </w:p>
     <w:p>
       <w:pPr>
-        <w:spacing w:before="0" w:after="200" w:line="240" w:lineRule="auto"/>
+        <w:spacing w:before="0" w:after="200" w:line="276" w:lineRule="exact"/>
         <w:ind w:left="0" w:right="0" w:firstLine="0"/>
       </w:pPr>
       <w:r>
@@ -911,7 +911,7 @@
     <w:p>
       <w:pPr>
         <w:keepLines/>
-        <w:spacing w:before="0" w:after="200" w:line="240" w:lineRule="auto"/>
+        <w:spacing w:before="0" w:after="200" w:line="276" w:lineRule="exact"/>
         <w:ind w:left="420" w:right="0" w:hanging="420"/>
       </w:pPr>
       <w:r>
@@ -926,7 +926,7 @@
     </w:p>
     <w:p>
       <w:pPr>
-        <w:spacing w:before="0" w:after="240" w:line="240" w:lineRule="auto"/>
+        <w:spacing w:before="0" w:after="240" w:line="276" w:lineRule="exact"/>
         <w:ind w:left="0" w:right="0" w:firstLine="0"/>
       </w:pPr>
       <w:r>
@@ -936,7 +936,7 @@
     <w:p>
       <w:pPr>
         <w:keepNext/>
-        <w:spacing w:before="0" w:after="280" w:line="240" w:lineRule="auto"/>
+        <w:spacing w:before="0" w:after="280" w:line="276" w:lineRule="exact"/>
         <w:ind w:left="0" w:right="0" w:firstLine="0"/>
       </w:pPr>
       <w:r>
@@ -961,7 +961,7 @@
     <w:p>
       <w:pPr>
         <w:keepNext/>
-        <w:spacing w:before="0" w:after="0" w:line="240" w:lineRule="auto"/>
+        <w:spacing w:before="0" w:after="0" w:line="276" w:lineRule="exact"/>
         <w:ind w:left="0" w:right="0" w:firstLine="0"/>
       </w:pPr>
       <w:r>
@@ -986,7 +986,7 @@
     <w:p>
       <w:pPr>
         <w:keepNext/>
-        <w:spacing w:before="0" w:after="0" w:line="240" w:lineRule="auto"/>
+        <w:spacing w:before="0" w:after="0" w:line="276" w:lineRule="exact"/>
         <w:ind w:left="0" w:right="0" w:firstLine="0"/>
       </w:pPr>
       <w:r>
@@ -1023,7 +1023,7 @@
     <w:p>
       <w:pPr>
         <w:keepNext/>
-        <w:spacing w:before="0" w:after="0" w:line="240" w:lineRule="auto"/>
+        <w:spacing w:before="0" w:after="0" w:line="276" w:lineRule="exact"/>
         <w:ind w:left="0" w:right="0" w:firstLine="0"/>
       </w:pPr>
       <w:r>
@@ -1064,7 +1064,7 @@
     </w:p>
     <w:p>
       <w:pPr>
-        <w:spacing w:before="0" w:after="0" w:line="240" w:lineRule="auto"/>
+        <w:spacing w:before="0" w:after="0" w:line="276" w:lineRule="exact"/>
         <w:ind w:left="0" w:right="0" w:firstLine="0"/>
       </w:pPr>
       <w:r>
@@ -1093,7 +1093,7 @@
       <w:pPr>
         <w:keepNext/>
         <w:pageBreakBefore/>
-        <w:spacing w:before="0" w:after="120" w:line="240" w:lineRule="auto"/>
+        <w:spacing w:before="0" w:after="120" w:line="276" w:lineRule="exact"/>
         <w:ind w:left="0" w:right="0" w:firstLine="0"/>
         <w:jc w:val="center"/>
       </w:pPr>
@@ -1109,7 +1109,7 @@
     <w:p>
       <w:pPr>
         <w:keepNext/>
-        <w:spacing w:before="0" w:after="160" w:line="240" w:lineRule="auto"/>
+        <w:spacing w:before="0" w:after="160" w:line="276" w:lineRule="exact"/>
         <w:ind w:left="0" w:right="0" w:firstLine="0"/>
         <w:jc w:val="right"/>
       </w:pPr>
@@ -1128,7 +1128,7 @@
         <w:tabs>
           <w:tab w:val="right" w:leader="dot" w:pos="7900"/>
         </w:tabs>
-        <w:spacing w:before="120" w:after="0" w:line="240" w:lineRule="auto"/>
+        <w:spacing w:before="120" w:after="0" w:line="276" w:lineRule="exact"/>
         <w:ind w:left="720" w:right="620" w:hanging="720"/>
       </w:pPr>
       <w:r>
@@ -1153,7 +1153,7 @@
         <w:tabs>
           <w:tab w:val="right" w:leader="dot" w:pos="7900"/>
         </w:tabs>
-        <w:spacing w:before="120" w:after="0" w:line="240" w:lineRule="auto"/>
+        <w:spacing w:before="120" w:after="0" w:line="276" w:lineRule="exact"/>
         <w:ind w:left="720" w:right="620" w:hanging="720"/>
       </w:pPr>
       <w:r>
@@ -1178,7 +1178,7 @@
         <w:tabs>
           <w:tab w:val="right" w:leader="dot" w:pos="7900"/>
         </w:tabs>
-        <w:spacing w:before="120" w:after="0" w:line="240" w:lineRule="auto"/>
+        <w:spacing w:before="120" w:after="0" w:line="276" w:lineRule="exact"/>
         <w:ind w:left="720" w:right="620" w:hanging="720"/>
       </w:pPr>
       <w:r>
@@ -1203,7 +1203,7 @@
         <w:tabs>
           <w:tab w:val="right" w:leader="dot" w:pos="7900"/>
         </w:tabs>
-        <w:spacing w:before="120" w:after="0" w:line="240" w:lineRule="auto"/>
+        <w:spacing w:before="120" w:after="0" w:line="276" w:lineRule="exact"/>
         <w:ind w:left="720" w:right="620" w:hanging="720"/>
       </w:pPr>
       <w:r>
@@ -1228,7 +1228,7 @@
         <w:tabs>
           <w:tab w:val="right" w:leader="dot" w:pos="7900"/>
         </w:tabs>
-        <w:spacing w:before="60" w:after="0" w:line="240" w:lineRule="auto"/>
+        <w:spacing w:before="60" w:after="0" w:line="276" w:lineRule="exact"/>
         <w:ind w:left="720" w:right="620" w:hanging="720"/>
       </w:pPr>
       <w:r>
@@ -1256,7 +1256,7 @@
         <w:tabs>
           <w:tab w:val="right" w:leader="dot" w:pos="7900"/>
         </w:tabs>
-        <w:spacing w:before="60" w:after="0" w:line="240" w:lineRule="auto"/>
+        <w:spacing w:before="60" w:after="0" w:line="276" w:lineRule="exact"/>
         <w:ind w:left="720" w:right="620" w:hanging="720"/>
       </w:pPr>
       <w:r>
@@ -1284,7 +1284,7 @@
         <w:tabs>
           <w:tab w:val="right" w:leader="dot" w:pos="7900"/>
         </w:tabs>
-        <w:spacing w:before="120" w:after="0" w:line="240" w:lineRule="auto"/>
+        <w:spacing w:before="120" w:after="0" w:line="276" w:lineRule="exact"/>
         <w:ind w:left="720" w:right="620" w:hanging="720"/>
       </w:pPr>
       <w:r>
@@ -1309,7 +1309,7 @@
         <w:tabs>
           <w:tab w:val="right" w:leader="dot" w:pos="7900"/>
         </w:tabs>
-        <w:spacing w:before="60" w:after="0" w:line="240" w:lineRule="auto"/>
+        <w:spacing w:before="60" w:after="0" w:line="276" w:lineRule="exact"/>
         <w:ind w:left="720" w:right="620" w:hanging="720"/>
       </w:pPr>
       <w:r>
@@ -1337,7 +1337,7 @@
         <w:tabs>
           <w:tab w:val="right" w:leader="dot" w:pos="7900"/>
         </w:tabs>
-        <w:spacing w:before="60" w:after="0" w:line="240" w:lineRule="auto"/>
+        <w:spacing w:before="60" w:after="0" w:line="276" w:lineRule="exact"/>
         <w:ind w:left="1440" w:right="620" w:hanging="720"/>
       </w:pPr>
       <w:r>
@@ -1365,7 +1365,7 @@
         <w:tabs>
           <w:tab w:val="right" w:leader="dot" w:pos="7900"/>
         </w:tabs>
-        <w:spacing w:before="60" w:after="0" w:line="240" w:lineRule="auto"/>
+        <w:spacing w:before="60" w:after="0" w:line="276" w:lineRule="exact"/>
         <w:ind w:left="1440" w:right="620" w:hanging="720"/>
       </w:pPr>
       <w:r>
@@ -1393,7 +1393,7 @@
         <w:tabs>
           <w:tab w:val="right" w:leader="dot" w:pos="7900"/>
         </w:tabs>
-        <w:spacing w:before="60" w:after="0" w:line="240" w:lineRule="auto"/>
+        <w:spacing w:before="60" w:after="0" w:line="276" w:lineRule="exact"/>
         <w:ind w:left="720" w:right="620" w:hanging="720"/>
       </w:pPr>
       <w:r>
@@ -1421,7 +1421,7 @@
         <w:tabs>
           <w:tab w:val="right" w:leader="dot" w:pos="7900"/>
         </w:tabs>
-        <w:spacing w:before="120" w:after="0" w:line="240" w:lineRule="auto"/>
+        <w:spacing w:before="120" w:after="0" w:line="276" w:lineRule="exact"/>
         <w:ind w:left="720" w:right="620" w:hanging="720"/>
       </w:pPr>
       <w:r>
@@ -1446,7 +1446,7 @@
         <w:tabs>
           <w:tab w:val="right" w:leader="dot" w:pos="7900"/>
         </w:tabs>
-        <w:spacing w:before="120" w:after="0" w:line="240" w:lineRule="auto"/>
+        <w:spacing w:before="120" w:after="0" w:line="276" w:lineRule="exact"/>
         <w:ind w:left="720" w:right="620" w:hanging="720"/>
       </w:pPr>
       <w:r>
@@ -1471,7 +1471,7 @@
         <w:tabs>
           <w:tab w:val="right" w:leader="dot" w:pos="7900"/>
         </w:tabs>
-        <w:spacing w:before="120" w:after="0" w:line="240" w:lineRule="auto"/>
+        <w:spacing w:before="120" w:after="0" w:line="276" w:lineRule="exact"/>
         <w:ind w:left="720" w:right="620" w:hanging="720"/>
       </w:pPr>
       <w:r>
@@ -1495,7 +1495,7 @@
         <w:pStyle w:val="Heading1"/>
         <w:keepNext/>
         <w:pageBreakBefore/>
-        <w:spacing w:before="0" w:after="240" w:line="240" w:lineRule="auto"/>
+        <w:spacing w:before="0" w:after="240" w:line="276" w:lineRule="exact"/>
         <w:ind w:left="0" w:right="0" w:firstLine="0"/>
         <w:jc w:val="center"/>
       </w:pPr>
@@ -1514,7 +1514,7 @@
         <w:tabs>
           <w:tab w:val="right" w:pos="7900"/>
         </w:tabs>
-        <w:spacing w:before="240" w:after="40" w:line="240" w:lineRule="auto"/>
+        <w:spacing w:before="240" w:after="40" w:line="276" w:lineRule="exact"/>
         <w:ind w:left="0" w:right="0" w:firstLine="0"/>
       </w:pPr>
       <w:r>
@@ -1542,7 +1542,7 @@
         <w:tabs>
           <w:tab w:val="right" w:leader="dot" w:pos="7900"/>
         </w:tabs>
-        <w:spacing w:before="140" w:after="0" w:line="240" w:lineRule="auto"/>
+        <w:spacing w:before="140" w:after="0" w:line="276" w:lineRule="exact"/>
         <w:ind w:left="504" w:right="1120" w:hanging="504"/>
       </w:pPr>
       <w:r>
@@ -1649,7 +1649,7 @@
         <w:tabs>
           <w:tab w:val="right" w:leader="dot" w:pos="7900"/>
         </w:tabs>
-        <w:spacing w:before="140" w:after="0" w:line="240" w:lineRule="auto"/>
+        <w:spacing w:before="140" w:after="0" w:line="276" w:lineRule="exact"/>
         <w:ind w:left="504" w:right="1120" w:hanging="504"/>
       </w:pPr>
       <w:r>
@@ -1828,7 +1828,7 @@
         <w:tabs>
           <w:tab w:val="right" w:leader="dot" w:pos="7900"/>
         </w:tabs>
-        <w:spacing w:before="140" w:after="0" w:line="240" w:lineRule="auto"/>
+        <w:spacing w:before="140" w:after="0" w:line="276" w:lineRule="exact"/>
         <w:ind w:left="504" w:right="1120" w:hanging="504"/>
       </w:pPr>
       <w:r>
@@ -1949,7 +1949,7 @@
         <w:tabs>
           <w:tab w:val="right" w:leader="dot" w:pos="7900"/>
         </w:tabs>
-        <w:spacing w:before="140" w:after="0" w:line="240" w:lineRule="auto"/>
+        <w:spacing w:before="140" w:after="0" w:line="276" w:lineRule="exact"/>
         <w:ind w:left="504" w:right="1120" w:hanging="504"/>
       </w:pPr>
       <w:r>
@@ -2070,7 +2070,7 @@
         <w:tabs>
           <w:tab w:val="right" w:leader="dot" w:pos="7900"/>
         </w:tabs>
-        <w:spacing w:before="140" w:after="0" w:line="240" w:lineRule="auto"/>
+        <w:spacing w:before="140" w:after="0" w:line="276" w:lineRule="exact"/>
         <w:ind w:left="504" w:right="1120" w:hanging="504"/>
       </w:pPr>
       <w:r>
@@ -2165,7 +2165,7 @@
         <w:tabs>
           <w:tab w:val="right" w:leader="dot" w:pos="7900"/>
         </w:tabs>
-        <w:spacing w:before="140" w:after="0" w:line="240" w:lineRule="auto"/>
+        <w:spacing w:before="140" w:after="0" w:line="276" w:lineRule="exact"/>
         <w:ind w:left="504" w:right="1120" w:hanging="504"/>
       </w:pPr>
       <w:r>
@@ -2286,7 +2286,7 @@
         <w:tabs>
           <w:tab w:val="right" w:leader="dot" w:pos="7900"/>
         </w:tabs>
-        <w:spacing w:before="140" w:after="0" w:line="240" w:lineRule="auto"/>
+        <w:spacing w:before="140" w:after="0" w:line="276" w:lineRule="exact"/>
         <w:ind w:left="504" w:right="1120" w:hanging="504"/>
       </w:pPr>
       <w:r>
@@ -2395,7 +2395,7 @@
         <w:tabs>
           <w:tab w:val="right" w:leader="dot" w:pos="7900"/>
         </w:tabs>
-        <w:spacing w:before="140" w:after="0" w:line="240" w:lineRule="auto"/>
+        <w:spacing w:before="140" w:after="0" w:line="276" w:lineRule="exact"/>
         <w:ind w:left="504" w:right="1120" w:hanging="504"/>
       </w:pPr>
       <w:r>
@@ -2504,7 +2504,7 @@
         <w:tabs>
           <w:tab w:val="right" w:pos="7900"/>
         </w:tabs>
-        <w:spacing w:before="320" w:after="40" w:line="240" w:lineRule="auto"/>
+        <w:spacing w:before="320" w:after="40" w:line="276" w:lineRule="exact"/>
         <w:ind w:left="0" w:right="0" w:firstLine="0"/>
       </w:pPr>
       <w:r>
@@ -2521,7 +2521,7 @@
         <w:tabs>
           <w:tab w:val="right" w:leader="dot" w:pos="7900"/>
         </w:tabs>
-        <w:spacing w:before="140" w:after="0" w:line="240" w:lineRule="auto"/>
+        <w:spacing w:before="140" w:after="0" w:line="276" w:lineRule="exact"/>
         <w:ind w:left="504" w:right="1120" w:hanging="504"/>
       </w:pPr>
       <w:r>
@@ -2555,7 +2555,7 @@
         <w:tabs>
           <w:tab w:val="right" w:leader="dot" w:pos="7900"/>
         </w:tabs>
-        <w:spacing w:before="140" w:after="0" w:line="240" w:lineRule="auto"/>
+        <w:spacing w:before="140" w:after="0" w:line="276" w:lineRule="exact"/>
         <w:ind w:left="504" w:right="1120" w:hanging="504"/>
       </w:pPr>
       <w:r>
@@ -2589,7 +2589,7 @@
         <w:tabs>
           <w:tab w:val="right" w:pos="7900"/>
         </w:tabs>
-        <w:spacing w:before="320" w:after="40" w:line="240" w:lineRule="auto"/>
+        <w:spacing w:before="320" w:after="40" w:line="276" w:lineRule="exact"/>
         <w:ind w:left="0" w:right="0" w:firstLine="0"/>
       </w:pPr>
       <w:r>
@@ -2606,7 +2606,7 @@
         <w:tabs>
           <w:tab w:val="right" w:leader="dot" w:pos="7900"/>
         </w:tabs>
-        <w:spacing w:before="140" w:after="0" w:line="240" w:lineRule="auto"/>
+        <w:spacing w:before="140" w:after="0" w:line="276" w:lineRule="exact"/>
         <w:ind w:left="504" w:right="1120" w:hanging="504"/>
       </w:pPr>
       <w:r>
@@ -2664,7 +2664,7 @@
         <w:tabs>
           <w:tab w:val="right" w:pos="7900"/>
         </w:tabs>
-        <w:spacing w:before="320" w:after="40" w:line="240" w:lineRule="auto"/>
+        <w:spacing w:before="320" w:after="40" w:line="276" w:lineRule="exact"/>
         <w:ind w:left="0" w:right="0" w:firstLine="0"/>
       </w:pPr>
       <w:r>
@@ -2681,7 +2681,7 @@
         <w:tabs>
           <w:tab w:val="right" w:leader="dot" w:pos="7900"/>
         </w:tabs>
-        <w:spacing w:before="140" w:after="0" w:line="240" w:lineRule="auto"/>
+        <w:spacing w:before="140" w:after="0" w:line="276" w:lineRule="exact"/>
         <w:ind w:left="504" w:right="1120" w:hanging="504"/>
       </w:pPr>
       <w:r>
@@ -3395,7 +3395,7 @@
     <w:p>
       <w:pPr>
         <w:keepNext/>
-        <w:spacing w:before="280" w:after="160" w:line="240" w:lineRule="auto"/>
+        <w:spacing w:before="280" w:after="160" w:line="276" w:lineRule="exact"/>
         <w:ind w:left="0" w:right="0" w:firstLine="0"/>
       </w:pPr>
       <w:r>
@@ -3420,7 +3420,7 @@
     <w:p>
       <w:pPr>
         <w:keepNext/>
-        <w:spacing w:before="0" w:after="0" w:line="240" w:lineRule="auto"/>
+        <w:spacing w:before="0" w:after="0" w:line="276" w:lineRule="exact"/>
         <w:ind w:left="3960" w:right="0" w:firstLine="0"/>
       </w:pPr>
       <w:r>
@@ -3430,7 +3430,7 @@
     <w:p>
       <w:pPr>
         <w:keepNext/>
-        <w:spacing w:before="0" w:after="0" w:line="240" w:lineRule="auto"/>
+        <w:spacing w:before="0" w:after="0" w:line="276" w:lineRule="exact"/>
         <w:ind w:left="3960" w:right="0" w:firstLine="0"/>
       </w:pPr>
       <w:r>
@@ -3506,7 +3506,7 @@
         <w:tabs>
           <w:tab w:val="left" w:pos="7704"/>
         </w:tabs>
-        <w:spacing w:before="280" w:after="0" w:line="240" w:lineRule="auto"/>
+        <w:spacing w:before="280" w:after="0" w:line="276" w:lineRule="exact"/>
         <w:ind w:left="3960" w:right="0" w:firstLine="0"/>
       </w:pPr>
       <w:r>
@@ -3522,7 +3522,7 @@
     <w:p>
       <w:pPr>
         <w:keepNext/>
-        <w:spacing w:before="0" w:after="0" w:line="240" w:lineRule="auto"/>
+        <w:spacing w:before="0" w:after="0" w:line="276" w:lineRule="exact"/>
         <w:ind w:left="3960" w:right="0" w:firstLine="0"/>
       </w:pPr>
       <w:r>
@@ -3544,7 +3544,7 @@
     <w:p>
       <w:pPr>
         <w:keepNext/>
-        <w:spacing w:before="0" w:after="0" w:line="240" w:lineRule="auto"/>
+        <w:spacing w:before="0" w:after="0" w:line="276" w:lineRule="exact"/>
         <w:ind w:left="3960" w:right="0" w:firstLine="0"/>
       </w:pPr>
       <w:r>
@@ -3585,7 +3585,7 @@
     </w:p>
     <w:p>
       <w:pPr>
-        <w:spacing w:before="0" w:after="0" w:line="240" w:lineRule="auto"/>
+        <w:spacing w:before="0" w:after="0" w:line="276" w:lineRule="exact"/>
         <w:ind w:left="3960" w:right="0" w:firstLine="0"/>
       </w:pPr>
       <w:r>
@@ -3615,7 +3615,7 @@
         <w:pStyle w:val="Heading1"/>
         <w:keepNext/>
         <w:pageBreakBefore/>
-        <w:spacing w:before="0" w:after="240" w:line="240" w:lineRule="auto"/>
+        <w:spacing w:before="0" w:after="240" w:line="276" w:lineRule="exact"/>
         <w:ind w:left="0" w:right="0" w:firstLine="0"/>
         <w:jc w:val="center"/>
       </w:pPr>
@@ -3630,7 +3630,7 @@
     </w:p>
     <w:p>
       <w:pPr>
-        <w:spacing w:before="0" w:after="280" w:line="240" w:lineRule="auto"/>
+        <w:spacing w:before="0" w:after="280" w:line="276" w:lineRule="exact"/>
         <w:ind w:left="0" w:right="0" w:firstLine="0"/>
       </w:pPr>
       <w:r>
@@ -3652,7 +3652,7 @@
     <w:p>
       <w:pPr>
         <w:keepNext/>
-        <w:spacing w:before="0" w:after="280" w:line="240" w:lineRule="auto"/>
+        <w:spacing w:before="0" w:after="280" w:line="276" w:lineRule="exact"/>
         <w:ind w:left="0" w:right="0" w:firstLine="0"/>
       </w:pPr>
       <w:r>
@@ -3677,7 +3677,7 @@
     <w:p>
       <w:pPr>
         <w:keepNext/>
-        <w:spacing w:before="0" w:after="0" w:line="240" w:lineRule="auto"/>
+        <w:spacing w:before="0" w:after="0" w:line="276" w:lineRule="exact"/>
         <w:ind w:left="3960" w:right="0" w:firstLine="0"/>
       </w:pPr>
       <w:r>
@@ -3699,7 +3699,7 @@
     <w:p>
       <w:pPr>
         <w:keepNext/>
-        <w:spacing w:before="0" w:after="0" w:line="240" w:lineRule="auto"/>
+        <w:spacing w:before="0" w:after="0" w:line="276" w:lineRule="exact"/>
         <w:ind w:left="3960" w:right="0" w:firstLine="0"/>
       </w:pPr>
       <w:r>
@@ -3740,7 +3740,7 @@
     </w:p>
     <w:p>
       <w:pPr>
-        <w:spacing w:before="0" w:after="0" w:line="240" w:lineRule="auto"/>
+        <w:spacing w:before="0" w:after="0" w:line="276" w:lineRule="exact"/>
         <w:ind w:left="3960" w:right="0" w:firstLine="0"/>
       </w:pPr>
       <w:r>
@@ -3770,7 +3770,7 @@
         <w:pStyle w:val="Heading1"/>
         <w:keepNext/>
         <w:pageBreakBefore/>
-        <w:spacing w:before="0" w:after="240" w:line="240" w:lineRule="auto"/>
+        <w:spacing w:before="0" w:after="240" w:line="276" w:lineRule="exact"/>
         <w:ind w:left="0" w:right="0" w:firstLine="0"/>
         <w:jc w:val="center"/>
       </w:pPr>
@@ -3785,7 +3785,7 @@
     </w:p>
     <w:p>
       <w:pPr>
-        <w:spacing w:before="0" w:after="240" w:line="240" w:lineRule="auto"/>
+        <w:spacing w:before="0" w:after="240" w:line="276" w:lineRule="exact"/>
         <w:ind w:left="0" w:right="0" w:firstLine="0"/>
       </w:pPr>
       <w:r>
@@ -3848,7 +3848,7 @@
     </w:p>
     <w:p>
       <w:pPr>
-        <w:spacing w:before="0" w:after="240" w:line="240" w:lineRule="auto"/>
+        <w:spacing w:before="0" w:after="240" w:line="276" w:lineRule="exact"/>
         <w:ind w:left="0" w:right="0" w:firstLine="0"/>
       </w:pPr>
       <w:r>
@@ -3869,7 +3869,7 @@
     </w:p>
     <w:p>
       <w:pPr>
-        <w:spacing w:before="0" w:after="240" w:line="240" w:lineRule="auto"/>
+        <w:spacing w:before="0" w:after="240" w:line="276" w:lineRule="exact"/>
         <w:ind w:left="0" w:right="0" w:firstLine="0"/>
       </w:pPr>
       <w:r>
@@ -4058,7 +4058,7 @@
     </w:p>
     <w:p>
       <w:pPr>
-        <w:spacing w:before="0" w:after="240" w:line="240" w:lineRule="auto"/>
+        <w:spacing w:before="0" w:after="240" w:line="276" w:lineRule="exact"/>
         <w:ind w:left="0" w:right="0" w:firstLine="0"/>
       </w:pPr>
       <w:r>
@@ -4315,7 +4315,7 @@
       <w:pPr>
         <w:keepNext/>
         <w:keepLines/>
-        <w:spacing w:before="0" w:after="0" w:line="240" w:lineRule="auto"/>
+        <w:spacing w:before="0" w:after="0" w:line="276" w:lineRule="exact"/>
         <w:ind w:left="720" w:right="0" w:firstLine="0"/>
       </w:pPr>
       <w:r>
@@ -4367,7 +4367,7 @@
     <w:p>
       <w:pPr>
         <w:keepLines/>
-        <w:spacing w:before="0" w:after="240" w:line="240" w:lineRule="auto"/>
+        <w:spacing w:before="0" w:after="240" w:line="276" w:lineRule="exact"/>
         <w:ind w:left="720" w:right="0" w:firstLine="0"/>
       </w:pPr>
       <w:r>
@@ -4408,7 +4408,7 @@
       <w:pPr>
         <w:keepNext/>
         <w:keepLines/>
-        <w:spacing w:before="0" w:after="0" w:line="240" w:lineRule="auto"/>
+        <w:spacing w:before="0" w:after="0" w:line="276" w:lineRule="exact"/>
         <w:ind w:left="720" w:right="0" w:firstLine="0"/>
       </w:pPr>
       <w:r>
@@ -4556,7 +4556,7 @@
     <w:p>
       <w:pPr>
         <w:keepLines/>
-        <w:spacing w:before="0" w:after="240" w:line="240" w:lineRule="auto"/>
+        <w:spacing w:before="0" w:after="240" w:line="276" w:lineRule="exact"/>
         <w:ind w:left="720" w:right="0" w:firstLine="0"/>
       </w:pPr>
       <w:r>
@@ -4637,7 +4637,7 @@
     </w:p>
     <w:p>
       <w:pPr>
-        <w:spacing w:before="0" w:after="240" w:line="240" w:lineRule="auto"/>
+        <w:spacing w:before="0" w:after="240" w:line="276" w:lineRule="exact"/>
         <w:ind w:left="0" w:right="0" w:firstLine="0"/>
       </w:pPr>
       <w:r>
@@ -4647,7 +4647,7 @@
     <w:p>
       <w:pPr>
         <w:keepNext/>
-        <w:spacing w:before="0" w:after="280" w:line="240" w:lineRule="auto"/>
+        <w:spacing w:before="0" w:after="280" w:line="276" w:lineRule="exact"/>
         <w:ind w:left="0" w:right="0" w:firstLine="0"/>
       </w:pPr>
       <w:r>
@@ -4680,7 +4680,7 @@
     </w:p>
     <w:p>
       <w:pPr>
-        <w:spacing w:before="0" w:after="0" w:line="240" w:lineRule="auto"/>
+        <w:spacing w:before="0" w:after="0" w:line="276" w:lineRule="exact"/>
         <w:ind w:left="3960" w:right="0" w:firstLine="0"/>
       </w:pPr>
       <w:r>
@@ -5011,7 +5011,7 @@
     <w:qFormat/>
     <w:rsid w:val="00A10FD9"/>
     <w:pPr>
-      <w:spacing w:after="80" w:line="240" w:lineRule="auto"/>
+      <w:spacing w:after="80" w:line="276" w:lineRule="exact"/>
       <w:contextualSpacing/>
       <w:jc w:val="center"/>
     </w:pPr>
@@ -5144,7 +5144,7 @@
     <w:pPr>
       <w:keepNext/>
       <w:keepLines/>
-      <w:spacing w:before="240" w:after="240" w:line="240" w:lineRule="auto"/>
+      <w:spacing w:before="240" w:after="240" w:line="276" w:lineRule="exact"/>
       <w:ind w:firstLine="0"/>
       <w:jc w:val="center"/>
       <w:outlineLvl w:val="0"/>
@@ -5168,7 +5168,7 @@
     <w:pPr>
       <w:keepNext/>
       <w:keepLines/>
-      <w:spacing w:before="240" w:after="240" w:line="240" w:lineRule="auto"/>
+      <w:spacing w:before="240" w:after="240" w:line="276" w:lineRule="exact"/>
       <w:ind w:left="720" w:hanging="720"/>
       <w:jc w:val="left"/>
       <w:outlineLvl w:val="1"/>
@@ -5191,7 +5191,7 @@
     <w:pPr>
       <w:keepNext/>
       <w:keepLines/>
-      <w:spacing w:before="240" w:after="240" w:line="240" w:lineRule="auto"/>
+      <w:spacing w:before="240" w:after="240" w:line="276" w:lineRule="exact"/>
       <w:ind w:left="1440" w:hanging="720"/>
       <w:jc w:val="left"/>
       <w:outlineLvl w:val="2"/>
@@ -5214,7 +5214,7 @@
     <w:pPr>
       <w:keepNext/>
       <w:keepLines/>
-      <w:spacing w:before="240" w:after="240" w:line="240" w:lineRule="auto"/>
+      <w:spacing w:before="240" w:after="240" w:line="276" w:lineRule="exact"/>
       <w:ind w:left="2160" w:hanging="720"/>
       <w:jc w:val="left"/>
       <w:outlineLvl w:val="3"/>
@@ -5237,7 +5237,7 @@
     <w:pPr>
       <w:keepNext/>
       <w:keepLines/>
-      <w:spacing w:before="240" w:after="240" w:line="240" w:lineRule="auto"/>
+      <w:spacing w:before="240" w:after="240" w:line="276" w:lineRule="exact"/>
       <w:ind w:left="2880" w:hanging="720"/>
       <w:jc w:val="left"/>
       <w:outlineLvl w:val="4"/>
@@ -5260,7 +5260,7 @@
     <w:pPr>
       <w:keepNext/>
       <w:keepLines/>
-      <w:spacing w:before="240" w:after="240" w:line="240" w:lineRule="auto"/>
+      <w:spacing w:before="240" w:after="240" w:line="276" w:lineRule="exact"/>
       <w:ind w:left="3600" w:hanging="720"/>
       <w:jc w:val="left"/>
       <w:outlineLvl w:val="5"/>
@@ -5463,7 +5463,7 @@
     <w:next w:val="BodyText"/>
     <w:qFormat/>
     <w:pPr>
-      <w:spacing w:before="240" w:after="240" w:line="240" w:lineRule="auto"/>
+      <w:spacing w:before="240" w:after="240" w:line="276" w:lineRule="exact"/>
       <w:ind w:left="720" w:right="720" w:firstLine="0"/>
     </w:pPr>
   </w:style>
@@ -5475,7 +5475,7 @@
     <w:unhideWhenUsed/>
     <w:qFormat/>
     <w:pPr>
-      <w:spacing w:before="0" w:after="120" w:line="240" w:lineRule="auto"/>
+      <w:spacing w:before="0" w:after="120" w:line="276" w:lineRule="exact"/>
       <w:ind w:firstLine="0"/>
     </w:pPr>
     <w:rPr>
@@ -5611,7 +5611,7 @@
     <w:unhideWhenUsed/>
     <w:qFormat/>
     <w:pPr>
-      <w:spacing w:before="240" w:line="259" w:lineRule="auto"/>
+      <w:spacing w:before="240" w:line="276" w:lineRule="exact"/>
       <w:outlineLvl w:val="9"/>
     </w:pPr>
     <w:rPr>
@@ -5634,7 +5634,7 @@
     <w:basedOn w:val="Normal"/>
     <w:qFormat/>
     <w:pPr>
-      <w:spacing w:before="0" w:after="0" w:line="240" w:lineRule="auto"/>
+      <w:spacing w:before="0" w:after="0" w:line="276" w:lineRule="exact"/>
       <w:ind w:firstLine="0"/>
       <w:jc w:val="center"/>
     </w:pPr>
@@ -5644,7 +5644,7 @@
     <w:basedOn w:val="Normal"/>
     <w:qFormat/>
     <w:pPr>
-      <w:spacing w:before="0" w:after="0" w:line="240" w:lineRule="auto"/>
+      <w:spacing w:before="0" w:after="0" w:line="276" w:lineRule="exact"/>
       <w:ind w:firstLine="0"/>
       <w:jc w:val="left"/>
     </w:pPr>
@@ -5655,7 +5655,7 @@
     <w:qFormat/>
     <w:pPr>
       <w:keepNext/>
-      <w:spacing w:before="0" w:after="0" w:line="240" w:lineRule="auto"/>
+      <w:spacing w:before="0" w:after="0" w:line="276" w:lineRule="exact"/>
       <w:ind w:left="4320" w:firstLine="0"/>
       <w:jc w:val="left"/>
     </w:pPr>

</xml_diff>